<commit_message>
Revert "Merge pull request #23 from Fosh1er/feat/voice-input"
This reverts commit dc91c745ba5b7764fe20656cdb17dbc1f098056e, reversing
changes made to 80aed0208999918e1050bf0c1b09d557b959cbe5.
</commit_message>
<xml_diff>
--- a/docs/delivery/out/Пояснительная_записка_АИскра.docx
+++ b/docs/delivery/out/Пояснительная_записка_АИскра.docx
@@ -11619,7 +11619,7 @@
         <w:pStyle w:val="BodyText"/>
       </w:pPr>
       <w:r>
-        <w:t xml:space="preserve">Итог: реализовано — 59, частично — 14, не реализовано — 7, не относится к функциональности — 3 из 83. Из требований с приоритетом M реализовано полностью 42 из 48, остальные — частично: 2.2, 3.3, 4.4, 5.5, 8.7, 9.5.</w:t>
+        <w:t xml:space="preserve">Итог: реализовано — 58, частично — 15, не реализовано — 7, не относится к функциональности — 3 из 83. Из требований с приоритетом M реализовано полностью 42 из 48, остальные — частично: 2.2, 3.3, 4.4, 5.5, 8.7, 9.5.</w:t>
       </w:r>
     </w:p>
     <w:tbl>
@@ -15584,6 +15584,116 @@
                 <w:rFonts w:ascii="Times New Roman" w:hAnsi="Times New Roman"/>
                 <w:sz w:val="20"/>
               </w:rPr>
+              <w:t xml:space="preserve">частично</w:t>
+            </w:r>
+          </w:p>
+        </w:tc>
+        <w:tc>
+          <w:tcPr/>
+          <w:p>
+            <w:pPr>
+              <w:pStyle w:val="Compact"/>
+              <w:spacing w:line="240" w:lineRule="auto"/>
+              <w:ind w:firstLine="0"/>
+              <w:jc w:val="left"/>
+            </w:pPr>
+            <w:r>
+              <w:rPr>
+                <w:rFonts w:ascii="Times New Roman" w:hAnsi="Times New Roman"/>
+                <w:sz w:val="20"/>
+              </w:rPr>
+              <w:t xml:space="preserve">диалог текстом с ИИ-заявителем в рамках легенды; голосовой ввод оператора не реализован</w:t>
+            </w:r>
+          </w:p>
+        </w:tc>
+      </w:tr>
+      <w:tr>
+        <w:tc>
+          <w:tcPr/>
+          <w:p>
+            <w:pPr>
+              <w:pStyle w:val="Compact"/>
+              <w:spacing w:line="240" w:lineRule="auto"/>
+              <w:ind w:firstLine="0"/>
+              <w:jc w:val="left"/>
+            </w:pPr>
+            <w:r>
+              <w:rPr>
+                <w:rFonts w:ascii="Times New Roman" w:hAnsi="Times New Roman"/>
+                <w:sz w:val="20"/>
+              </w:rPr>
+              <w:t xml:space="preserve">5.1</w:t>
+            </w:r>
+          </w:p>
+        </w:tc>
+        <w:tc>
+          <w:tcPr/>
+          <w:p>
+            <w:pPr>
+              <w:pStyle w:val="Compact"/>
+              <w:spacing w:line="240" w:lineRule="auto"/>
+              <w:ind w:firstLine="0"/>
+              <w:jc w:val="left"/>
+            </w:pPr>
+            <w:r>
+              <w:rPr>
+                <w:rFonts w:ascii="Times New Roman" w:hAnsi="Times New Roman"/>
+                <w:sz w:val="20"/>
+              </w:rPr>
+              <w:t xml:space="preserve">Реестр (список) происшествий/карточек службы с очередью входящих; карточка и реестр визуально максимально похожи на АРМ ДДС (цвета, конфигурация)</w:t>
+            </w:r>
+          </w:p>
+        </w:tc>
+        <w:tc>
+          <w:tcPr/>
+          <w:p>
+            <w:pPr>
+              <w:pStyle w:val="Compact"/>
+              <w:spacing w:line="240" w:lineRule="auto"/>
+              <w:ind w:firstLine="0"/>
+              <w:jc w:val="left"/>
+            </w:pPr>
+            <w:r>
+              <w:rPr>
+                <w:rFonts w:ascii="Times New Roman" w:hAnsi="Times New Roman"/>
+                <w:sz w:val="20"/>
+              </w:rPr>
+              <w:t xml:space="preserve">M</w:t>
+            </w:r>
+          </w:p>
+        </w:tc>
+        <w:tc>
+          <w:tcPr/>
+          <w:p>
+            <w:pPr>
+              <w:pStyle w:val="Compact"/>
+              <w:spacing w:line="240" w:lineRule="auto"/>
+              <w:ind w:firstLine="0"/>
+              <w:jc w:val="left"/>
+            </w:pPr>
+            <w:r>
+              <w:rPr>
+                <w:rFonts w:ascii="Times New Roman" w:hAnsi="Times New Roman"/>
+                <w:sz w:val="20"/>
+              </w:rPr>
+              <w:t xml:space="preserve">2.1</w:t>
+            </w:r>
+          </w:p>
+        </w:tc>
+        <w:tc>
+          <w:tcPr/>
+          <w:p>
+            <w:pPr>
+              <w:pStyle w:val="Compact"/>
+              <w:spacing w:line="240" w:lineRule="auto"/>
+              <w:ind w:firstLine="0"/>
+              <w:jc w:val="left"/>
+            </w:pPr>
+            <w:r>
+              <w:rPr>
+                <w:rFonts w:ascii="Times New Roman" w:hAnsi="Times New Roman"/>
+                <w:sz w:val="20"/>
+              </w:rPr>
               <w:t xml:space="preserve">да</w:t>
             </w:r>
           </w:p>
@@ -15602,45 +15712,45 @@
                 <w:rFonts w:ascii="Times New Roman" w:hAnsi="Times New Roman"/>
                 <w:sz w:val="20"/>
               </w:rPr>
-              <w:t xml:space="preserve">диалог с ИИ-заявителем в рамках легенды — текстом или голосом (Whisper, кнопка «говорить»)</w:t>
-            </w:r>
-          </w:p>
-        </w:tc>
-      </w:tr>
-      <w:tr>
-        <w:tc>
-          <w:tcPr/>
-          <w:p>
-            <w:pPr>
-              <w:pStyle w:val="Compact"/>
-              <w:spacing w:line="240" w:lineRule="auto"/>
-              <w:ind w:firstLine="0"/>
-              <w:jc w:val="left"/>
-            </w:pPr>
-            <w:r>
-              <w:rPr>
-                <w:rFonts w:ascii="Times New Roman" w:hAnsi="Times New Roman"/>
-                <w:sz w:val="20"/>
-              </w:rPr>
-              <w:t xml:space="preserve">5.1</w:t>
-            </w:r>
-          </w:p>
-        </w:tc>
-        <w:tc>
-          <w:tcPr/>
-          <w:p>
-            <w:pPr>
-              <w:pStyle w:val="Compact"/>
-              <w:spacing w:line="240" w:lineRule="auto"/>
-              <w:ind w:firstLine="0"/>
-              <w:jc w:val="left"/>
-            </w:pPr>
-            <w:r>
-              <w:rPr>
-                <w:rFonts w:ascii="Times New Roman" w:hAnsi="Times New Roman"/>
-                <w:sz w:val="20"/>
-              </w:rPr>
-              <w:t xml:space="preserve">Реестр (список) происшествий/карточек службы с очередью входящих; карточка и реестр визуально максимально похожи на АРМ ДДС (цвета, конфигурация)</w:t>
+              <w:t xml:space="preserve">журнал службы с очередью «ждут решения», таймерами и сигналом</w:t>
+            </w:r>
+          </w:p>
+        </w:tc>
+      </w:tr>
+      <w:tr>
+        <w:tc>
+          <w:tcPr/>
+          <w:p>
+            <w:pPr>
+              <w:pStyle w:val="Compact"/>
+              <w:spacing w:line="240" w:lineRule="auto"/>
+              <w:ind w:firstLine="0"/>
+              <w:jc w:val="left"/>
+            </w:pPr>
+            <w:r>
+              <w:rPr>
+                <w:rFonts w:ascii="Times New Roman" w:hAnsi="Times New Roman"/>
+                <w:sz w:val="20"/>
+              </w:rPr>
+              <w:t xml:space="preserve">5.2</w:t>
+            </w:r>
+          </w:p>
+        </w:tc>
+        <w:tc>
+          <w:tcPr/>
+          <w:p>
+            <w:pPr>
+              <w:pStyle w:val="Compact"/>
+              <w:spacing w:line="240" w:lineRule="auto"/>
+              <w:ind w:firstLine="0"/>
+              <w:jc w:val="left"/>
+            </w:pPr>
+            <w:r>
+              <w:rPr>
+                <w:rFonts w:ascii="Times New Roman" w:hAnsi="Times New Roman"/>
+                <w:sz w:val="20"/>
+              </w:rPr>
+              <w:t xml:space="preserve">Получение карточки, сформированной системой «от 112» (или сформированной обучающимся-оператором 112 в смешанном режиме)</w:t>
             </w:r>
           </w:p>
         </w:tc>
@@ -15676,7 +15786,7 @@
                 <w:rFonts w:ascii="Times New Roman" w:hAnsi="Times New Roman"/>
                 <w:sz w:val="20"/>
               </w:rPr>
-              <w:t xml:space="preserve">2.1</w:t>
+              <w:t xml:space="preserve">2.1, 4.2</w:t>
             </w:r>
           </w:p>
         </w:tc>
@@ -15712,45 +15822,45 @@
                 <w:rFonts w:ascii="Times New Roman" w:hAnsi="Times New Roman"/>
                 <w:sz w:val="20"/>
               </w:rPr>
-              <w:t xml:space="preserve">журнал службы с очередью «ждут решения», таймерами и сигналом</w:t>
-            </w:r>
-          </w:p>
-        </w:tc>
-      </w:tr>
-      <w:tr>
-        <w:tc>
-          <w:tcPr/>
-          <w:p>
-            <w:pPr>
-              <w:pStyle w:val="Compact"/>
-              <w:spacing w:line="240" w:lineRule="auto"/>
-              <w:ind w:firstLine="0"/>
-              <w:jc w:val="left"/>
-            </w:pPr>
-            <w:r>
-              <w:rPr>
-                <w:rFonts w:ascii="Times New Roman" w:hAnsi="Times New Roman"/>
-                <w:sz w:val="20"/>
-              </w:rPr>
-              <w:t xml:space="preserve">5.2</w:t>
-            </w:r>
-          </w:p>
-        </w:tc>
-        <w:tc>
-          <w:tcPr/>
-          <w:p>
-            <w:pPr>
-              <w:pStyle w:val="Compact"/>
-              <w:spacing w:line="240" w:lineRule="auto"/>
-              <w:ind w:firstLine="0"/>
-              <w:jc w:val="left"/>
-            </w:pPr>
-            <w:r>
-              <w:rPr>
-                <w:rFonts w:ascii="Times New Roman" w:hAnsi="Times New Roman"/>
-                <w:sz w:val="20"/>
-              </w:rPr>
-              <w:t xml:space="preserve">Получение карточки, сформированной системой «от 112» (или сформированной обучающимся-оператором 112 в смешанном режиме)</w:t>
+              <w:t xml:space="preserve">карточки от системы и от операторов занятия</w:t>
+            </w:r>
+          </w:p>
+        </w:tc>
+      </w:tr>
+      <w:tr>
+        <w:tc>
+          <w:tcPr/>
+          <w:p>
+            <w:pPr>
+              <w:pStyle w:val="Compact"/>
+              <w:spacing w:line="240" w:lineRule="auto"/>
+              <w:ind w:firstLine="0"/>
+              <w:jc w:val="left"/>
+            </w:pPr>
+            <w:r>
+              <w:rPr>
+                <w:rFonts w:ascii="Times New Roman" w:hAnsi="Times New Roman"/>
+                <w:sz w:val="20"/>
+              </w:rPr>
+              <w:t xml:space="preserve">5.3</w:t>
+            </w:r>
+          </w:p>
+        </w:tc>
+        <w:tc>
+          <w:tcPr/>
+          <w:p>
+            <w:pPr>
+              <w:pStyle w:val="Compact"/>
+              <w:spacing w:line="240" w:lineRule="auto"/>
+              <w:ind w:firstLine="0"/>
+              <w:jc w:val="left"/>
+            </w:pPr>
+            <w:r>
+              <w:rPr>
+                <w:rFonts w:ascii="Times New Roman" w:hAnsi="Times New Roman"/>
+                <w:sz w:val="20"/>
+              </w:rPr>
+              <w:t xml:space="preserve">Принять / отклонить карточку по полномочиям службы; при отклонении — комментарий</w:t>
             </w:r>
           </w:p>
         </w:tc>
@@ -15786,7 +15896,7 @@
                 <w:rFonts w:ascii="Times New Roman" w:hAnsi="Times New Roman"/>
                 <w:sz w:val="20"/>
               </w:rPr>
-              <w:t xml:space="preserve">2.1, 4.2</w:t>
+              <w:t xml:space="preserve">2.2</w:t>
             </w:r>
           </w:p>
         </w:tc>
@@ -15822,45 +15932,45 @@
                 <w:rFonts w:ascii="Times New Roman" w:hAnsi="Times New Roman"/>
                 <w:sz w:val="20"/>
               </w:rPr>
-              <w:t xml:space="preserve">карточки от системы и от операторов занятия</w:t>
-            </w:r>
-          </w:p>
-        </w:tc>
-      </w:tr>
-      <w:tr>
-        <w:tc>
-          <w:tcPr/>
-          <w:p>
-            <w:pPr>
-              <w:pStyle w:val="Compact"/>
-              <w:spacing w:line="240" w:lineRule="auto"/>
-              <w:ind w:firstLine="0"/>
-              <w:jc w:val="left"/>
-            </w:pPr>
-            <w:r>
-              <w:rPr>
-                <w:rFonts w:ascii="Times New Roman" w:hAnsi="Times New Roman"/>
-                <w:sz w:val="20"/>
-              </w:rPr>
-              <w:t xml:space="preserve">5.3</w:t>
-            </w:r>
-          </w:p>
-        </w:tc>
-        <w:tc>
-          <w:tcPr/>
-          <w:p>
-            <w:pPr>
-              <w:pStyle w:val="Compact"/>
-              <w:spacing w:line="240" w:lineRule="auto"/>
-              <w:ind w:firstLine="0"/>
-              <w:jc w:val="left"/>
-            </w:pPr>
-            <w:r>
-              <w:rPr>
-                <w:rFonts w:ascii="Times New Roman" w:hAnsi="Times New Roman"/>
-                <w:sz w:val="20"/>
-              </w:rPr>
-              <w:t xml:space="preserve">Принять / отклонить карточку по полномочиям службы; при отклонении — комментарий</w:t>
+              <w:t xml:space="preserve">«Принята / Не принята» с комментарием</w:t>
+            </w:r>
+          </w:p>
+        </w:tc>
+      </w:tr>
+      <w:tr>
+        <w:tc>
+          <w:tcPr/>
+          <w:p>
+            <w:pPr>
+              <w:pStyle w:val="Compact"/>
+              <w:spacing w:line="240" w:lineRule="auto"/>
+              <w:ind w:firstLine="0"/>
+              <w:jc w:val="left"/>
+            </w:pPr>
+            <w:r>
+              <w:rPr>
+                <w:rFonts w:ascii="Times New Roman" w:hAnsi="Times New Roman"/>
+                <w:sz w:val="20"/>
+              </w:rPr>
+              <w:t xml:space="preserve">5.4</w:t>
+            </w:r>
+          </w:p>
+        </w:tc>
+        <w:tc>
+          <w:tcPr/>
+          <w:p>
+            <w:pPr>
+              <w:pStyle w:val="Compact"/>
+              <w:spacing w:line="240" w:lineRule="auto"/>
+              <w:ind w:firstLine="0"/>
+              <w:jc w:val="left"/>
+            </w:pPr>
+            <w:r>
+              <w:rPr>
+                <w:rFonts w:ascii="Times New Roman" w:hAnsi="Times New Roman"/>
+                <w:sz w:val="20"/>
+              </w:rPr>
+              <w:t xml:space="preserve">Диспетчер ДДС не контролирует правильность заполнения карточки (это 112 и служба контроля 112); службы в карточке ДДС не добавляет; видит, в какие…</w:t>
             </w:r>
           </w:p>
         </w:tc>
@@ -15932,45 +16042,45 @@
                 <w:rFonts w:ascii="Times New Roman" w:hAnsi="Times New Roman"/>
                 <w:sz w:val="20"/>
               </w:rPr>
-              <w:t xml:space="preserve">«Принята / Не принята» с комментарием</w:t>
-            </w:r>
-          </w:p>
-        </w:tc>
-      </w:tr>
-      <w:tr>
-        <w:tc>
-          <w:tcPr/>
-          <w:p>
-            <w:pPr>
-              <w:pStyle w:val="Compact"/>
-              <w:spacing w:line="240" w:lineRule="auto"/>
-              <w:ind w:firstLine="0"/>
-              <w:jc w:val="left"/>
-            </w:pPr>
-            <w:r>
-              <w:rPr>
-                <w:rFonts w:ascii="Times New Roman" w:hAnsi="Times New Roman"/>
-                <w:sz w:val="20"/>
-              </w:rPr>
-              <w:t xml:space="preserve">5.4</w:t>
-            </w:r>
-          </w:p>
-        </w:tc>
-        <w:tc>
-          <w:tcPr/>
-          <w:p>
-            <w:pPr>
-              <w:pStyle w:val="Compact"/>
-              <w:spacing w:line="240" w:lineRule="auto"/>
-              <w:ind w:firstLine="0"/>
-              <w:jc w:val="left"/>
-            </w:pPr>
-            <w:r>
-              <w:rPr>
-                <w:rFonts w:ascii="Times New Roman" w:hAnsi="Times New Roman"/>
-                <w:sz w:val="20"/>
-              </w:rPr>
-              <w:t xml:space="preserve">Диспетчер ДДС не контролирует правильность заполнения карточки (это 112 и служба контроля 112); службы в карточке ДДС не добавляет; видит, в какие…</w:t>
+              <w:t xml:space="preserve">карточка в ДДС только для чтения</w:t>
+            </w:r>
+          </w:p>
+        </w:tc>
+      </w:tr>
+      <w:tr>
+        <w:tc>
+          <w:tcPr/>
+          <w:p>
+            <w:pPr>
+              <w:pStyle w:val="Compact"/>
+              <w:spacing w:line="240" w:lineRule="auto"/>
+              <w:ind w:firstLine="0"/>
+              <w:jc w:val="left"/>
+            </w:pPr>
+            <w:r>
+              <w:rPr>
+                <w:rFonts w:ascii="Times New Roman" w:hAnsi="Times New Roman"/>
+                <w:sz w:val="20"/>
+              </w:rPr>
+              <w:t xml:space="preserve">5.5</w:t>
+            </w:r>
+          </w:p>
+        </w:tc>
+        <w:tc>
+          <w:tcPr/>
+          <w:p>
+            <w:pPr>
+              <w:pStyle w:val="Compact"/>
+              <w:spacing w:line="240" w:lineRule="auto"/>
+              <w:ind w:firstLine="0"/>
+              <w:jc w:val="left"/>
+            </w:pPr>
+            <w:r>
+              <w:rPr>
+                <w:rFonts w:ascii="Times New Roman" w:hAnsi="Times New Roman"/>
+                <w:sz w:val="20"/>
+              </w:rPr>
+              <w:t xml:space="preserve">Ручной выбор бригад/сил реагирования своей службы</w:t>
             </w:r>
           </w:p>
         </w:tc>
@@ -16024,6 +16134,116 @@
                 <w:rFonts w:ascii="Times New Roman" w:hAnsi="Times New Roman"/>
                 <w:sz w:val="20"/>
               </w:rPr>
+              <w:t xml:space="preserve">частично</w:t>
+            </w:r>
+          </w:p>
+        </w:tc>
+        <w:tc>
+          <w:tcPr/>
+          <w:p>
+            <w:pPr>
+              <w:pStyle w:val="Compact"/>
+              <w:spacing w:line="240" w:lineRule="auto"/>
+              <w:ind w:firstLine="0"/>
+              <w:jc w:val="left"/>
+            </w:pPr>
+            <w:r>
+              <w:rPr>
+                <w:rFonts w:ascii="Times New Roman" w:hAnsi="Times New Roman"/>
+                <w:sz w:val="20"/>
+              </w:rPr>
+              <w:t xml:space="preserve">силы фиксируются номером наряда и комментарием; справочника бригад для выбора нет</w:t>
+            </w:r>
+          </w:p>
+        </w:tc>
+      </w:tr>
+      <w:tr>
+        <w:tc>
+          <w:tcPr/>
+          <w:p>
+            <w:pPr>
+              <w:pStyle w:val="Compact"/>
+              <w:spacing w:line="240" w:lineRule="auto"/>
+              <w:ind w:firstLine="0"/>
+              <w:jc w:val="left"/>
+            </w:pPr>
+            <w:r>
+              <w:rPr>
+                <w:rFonts w:ascii="Times New Roman" w:hAnsi="Times New Roman"/>
+                <w:sz w:val="20"/>
+              </w:rPr>
+              <w:t xml:space="preserve">5.6</w:t>
+            </w:r>
+          </w:p>
+        </w:tc>
+        <w:tc>
+          <w:tcPr/>
+          <w:p>
+            <w:pPr>
+              <w:pStyle w:val="Compact"/>
+              <w:spacing w:line="240" w:lineRule="auto"/>
+              <w:ind w:firstLine="0"/>
+              <w:jc w:val="left"/>
+            </w:pPr>
+            <w:r>
+              <w:rPr>
+                <w:rFonts w:ascii="Times New Roman" w:hAnsi="Times New Roman"/>
+                <w:sz w:val="20"/>
+              </w:rPr>
+              <w:t xml:space="preserve">Связь по IP-телефону: исходящий звонок старшему группы реагирования (точка C), звонок заявителю (номер в карточке), входящий доклад от старшего…</w:t>
+            </w:r>
+          </w:p>
+        </w:tc>
+        <w:tc>
+          <w:tcPr/>
+          <w:p>
+            <w:pPr>
+              <w:pStyle w:val="Compact"/>
+              <w:spacing w:line="240" w:lineRule="auto"/>
+              <w:ind w:firstLine="0"/>
+              <w:jc w:val="left"/>
+            </w:pPr>
+            <w:r>
+              <w:rPr>
+                <w:rFonts w:ascii="Times New Roman" w:hAnsi="Times New Roman"/>
+                <w:sz w:val="20"/>
+              </w:rPr>
+              <w:t xml:space="preserve">M</w:t>
+            </w:r>
+          </w:p>
+        </w:tc>
+        <w:tc>
+          <w:tcPr/>
+          <w:p>
+            <w:pPr>
+              <w:pStyle w:val="Compact"/>
+              <w:spacing w:line="240" w:lineRule="auto"/>
+              <w:ind w:firstLine="0"/>
+              <w:jc w:val="left"/>
+            </w:pPr>
+            <w:r>
+              <w:rPr>
+                <w:rFonts w:ascii="Times New Roman" w:hAnsi="Times New Roman"/>
+                <w:sz w:val="20"/>
+              </w:rPr>
+              <w:t xml:space="preserve">2.3</w:t>
+            </w:r>
+          </w:p>
+        </w:tc>
+        <w:tc>
+          <w:tcPr/>
+          <w:p>
+            <w:pPr>
+              <w:pStyle w:val="Compact"/>
+              <w:spacing w:line="240" w:lineRule="auto"/>
+              <w:ind w:firstLine="0"/>
+              <w:jc w:val="left"/>
+            </w:pPr>
+            <w:r>
+              <w:rPr>
+                <w:rFonts w:ascii="Times New Roman" w:hAnsi="Times New Roman"/>
+                <w:sz w:val="20"/>
+              </w:rPr>
               <w:t xml:space="preserve">да</w:t>
             </w:r>
           </w:p>
@@ -16042,45 +16262,45 @@
                 <w:rFonts w:ascii="Times New Roman" w:hAnsi="Times New Roman"/>
                 <w:sz w:val="20"/>
               </w:rPr>
-              <w:t xml:space="preserve">карточка в ДДС только для чтения</w:t>
-            </w:r>
-          </w:p>
-        </w:tc>
-      </w:tr>
-      <w:tr>
-        <w:tc>
-          <w:tcPr/>
-          <w:p>
-            <w:pPr>
-              <w:pStyle w:val="Compact"/>
-              <w:spacing w:line="240" w:lineRule="auto"/>
-              <w:ind w:firstLine="0"/>
-              <w:jc w:val="left"/>
-            </w:pPr>
-            <w:r>
-              <w:rPr>
-                <w:rFonts w:ascii="Times New Roman" w:hAnsi="Times New Roman"/>
-                <w:sz w:val="20"/>
-              </w:rPr>
-              <w:t xml:space="preserve">5.5</w:t>
-            </w:r>
-          </w:p>
-        </w:tc>
-        <w:tc>
-          <w:tcPr/>
-          <w:p>
-            <w:pPr>
-              <w:pStyle w:val="Compact"/>
-              <w:spacing w:line="240" w:lineRule="auto"/>
-              <w:ind w:firstLine="0"/>
-              <w:jc w:val="left"/>
-            </w:pPr>
-            <w:r>
-              <w:rPr>
-                <w:rFonts w:ascii="Times New Roman" w:hAnsi="Times New Roman"/>
-                <w:sz w:val="20"/>
-              </w:rPr>
-              <w:t xml:space="preserve">Ручной выбор бригад/сил реагирования своей службы</w:t>
+              <w:t xml:space="preserve">имитация: старший группы, заявитель, другие службы; реальная SIP-телефония — нет</w:t>
+            </w:r>
+          </w:p>
+        </w:tc>
+      </w:tr>
+      <w:tr>
+        <w:tc>
+          <w:tcPr/>
+          <w:p>
+            <w:pPr>
+              <w:pStyle w:val="Compact"/>
+              <w:spacing w:line="240" w:lineRule="auto"/>
+              <w:ind w:firstLine="0"/>
+              <w:jc w:val="left"/>
+            </w:pPr>
+            <w:r>
+              <w:rPr>
+                <w:rFonts w:ascii="Times New Roman" w:hAnsi="Times New Roman"/>
+                <w:sz w:val="20"/>
+              </w:rPr>
+              <w:t xml:space="preserve">5.7</w:t>
+            </w:r>
+          </w:p>
+        </w:tc>
+        <w:tc>
+          <w:tcPr/>
+          <w:p>
+            <w:pPr>
+              <w:pStyle w:val="Compact"/>
+              <w:spacing w:line="240" w:lineRule="auto"/>
+              <w:ind w:firstLine="0"/>
+              <w:jc w:val="left"/>
+            </w:pPr>
+            <w:r>
+              <w:rPr>
+                <w:rFonts w:ascii="Times New Roman" w:hAnsi="Times New Roman"/>
+                <w:sz w:val="20"/>
+              </w:rPr>
+              <w:t xml:space="preserve">Смена статуса через карандаш на плитке своей службы: строка «Статус ▾ / Номер наряда / Комментарий / ✓ ×». Первый статус — «Принята» или «Не…</w:t>
             </w:r>
           </w:p>
         </w:tc>
@@ -16134,6 +16354,556 @@
                 <w:rFonts w:ascii="Times New Roman" w:hAnsi="Times New Roman"/>
                 <w:sz w:val="20"/>
               </w:rPr>
+              <w:t xml:space="preserve">да</w:t>
+            </w:r>
+          </w:p>
+        </w:tc>
+        <w:tc>
+          <w:tcPr/>
+          <w:p>
+            <w:pPr>
+              <w:pStyle w:val="Compact"/>
+              <w:spacing w:line="240" w:lineRule="auto"/>
+              <w:ind w:firstLine="0"/>
+              <w:jc w:val="left"/>
+            </w:pPr>
+            <w:r>
+              <w:rPr>
+                <w:rFonts w:ascii="Times New Roman" w:hAnsi="Times New Roman"/>
+                <w:sz w:val="20"/>
+              </w:rPr>
+              <w:t xml:space="preserve">карандаш на плитке службы: статус, номер наряда, комментарий</w:t>
+            </w:r>
+          </w:p>
+        </w:tc>
+      </w:tr>
+      <w:tr>
+        <w:tc>
+          <w:tcPr/>
+          <w:p>
+            <w:pPr>
+              <w:pStyle w:val="Compact"/>
+              <w:spacing w:line="240" w:lineRule="auto"/>
+              <w:ind w:firstLine="0"/>
+              <w:jc w:val="left"/>
+            </w:pPr>
+            <w:r>
+              <w:rPr>
+                <w:rFonts w:ascii="Times New Roman" w:hAnsi="Times New Roman"/>
+                <w:sz w:val="20"/>
+              </w:rPr>
+              <w:t xml:space="preserve">5.8</w:t>
+            </w:r>
+          </w:p>
+        </w:tc>
+        <w:tc>
+          <w:tcPr/>
+          <w:p>
+            <w:pPr>
+              <w:pStyle w:val="Compact"/>
+              <w:spacing w:line="240" w:lineRule="auto"/>
+              <w:ind w:firstLine="0"/>
+              <w:jc w:val="left"/>
+            </w:pPr>
+            <w:r>
+              <w:rPr>
+                <w:rFonts w:ascii="Times New Roman" w:hAnsi="Times New Roman"/>
+                <w:sz w:val="20"/>
+              </w:rPr>
+              <w:t xml:space="preserve">Универсальный алгоритм действий диспетчера для всех служб, без специфики службы</w:t>
+            </w:r>
+          </w:p>
+        </w:tc>
+        <w:tc>
+          <w:tcPr/>
+          <w:p>
+            <w:pPr>
+              <w:pStyle w:val="Compact"/>
+              <w:spacing w:line="240" w:lineRule="auto"/>
+              <w:ind w:firstLine="0"/>
+              <w:jc w:val="left"/>
+            </w:pPr>
+            <w:r>
+              <w:rPr>
+                <w:rFonts w:ascii="Times New Roman" w:hAnsi="Times New Roman"/>
+                <w:sz w:val="20"/>
+              </w:rPr>
+              <w:t xml:space="preserve">M</w:t>
+            </w:r>
+          </w:p>
+        </w:tc>
+        <w:tc>
+          <w:tcPr/>
+          <w:p>
+            <w:pPr>
+              <w:pStyle w:val="Compact"/>
+              <w:spacing w:line="240" w:lineRule="auto"/>
+              <w:ind w:firstLine="0"/>
+              <w:jc w:val="left"/>
+            </w:pPr>
+            <w:r>
+              <w:rPr>
+                <w:rFonts w:ascii="Times New Roman" w:hAnsi="Times New Roman"/>
+                <w:sz w:val="20"/>
+              </w:rPr>
+              <w:t xml:space="preserve">2.2</w:t>
+            </w:r>
+          </w:p>
+        </w:tc>
+        <w:tc>
+          <w:tcPr/>
+          <w:p>
+            <w:pPr>
+              <w:pStyle w:val="Compact"/>
+              <w:spacing w:line="240" w:lineRule="auto"/>
+              <w:ind w:firstLine="0"/>
+              <w:jc w:val="left"/>
+            </w:pPr>
+            <w:r>
+              <w:rPr>
+                <w:rFonts w:ascii="Times New Roman" w:hAnsi="Times New Roman"/>
+                <w:sz w:val="20"/>
+              </w:rPr>
+              <w:t xml:space="preserve">да</w:t>
+            </w:r>
+          </w:p>
+        </w:tc>
+        <w:tc>
+          <w:tcPr/>
+          <w:p>
+            <w:pPr>
+              <w:pStyle w:val="Compact"/>
+              <w:spacing w:line="240" w:lineRule="auto"/>
+              <w:ind w:firstLine="0"/>
+              <w:jc w:val="left"/>
+            </w:pPr>
+            <w:r>
+              <w:rPr>
+                <w:rFonts w:ascii="Times New Roman" w:hAnsi="Times New Roman"/>
+                <w:sz w:val="20"/>
+              </w:rPr>
+              <w:t xml:space="preserve">единый набор статусов для всех служб</w:t>
+            </w:r>
+          </w:p>
+        </w:tc>
+      </w:tr>
+      <w:tr>
+        <w:tc>
+          <w:tcPr/>
+          <w:p>
+            <w:pPr>
+              <w:pStyle w:val="Compact"/>
+              <w:spacing w:line="240" w:lineRule="auto"/>
+              <w:ind w:firstLine="0"/>
+              <w:jc w:val="left"/>
+            </w:pPr>
+            <w:r>
+              <w:rPr>
+                <w:rFonts w:ascii="Times New Roman" w:hAnsi="Times New Roman"/>
+                <w:sz w:val="20"/>
+              </w:rPr>
+              <w:t xml:space="preserve">5.9</w:t>
+            </w:r>
+          </w:p>
+        </w:tc>
+        <w:tc>
+          <w:tcPr/>
+          <w:p>
+            <w:pPr>
+              <w:pStyle w:val="Compact"/>
+              <w:spacing w:line="240" w:lineRule="auto"/>
+              <w:ind w:firstLine="0"/>
+              <w:jc w:val="left"/>
+            </w:pPr>
+            <w:r>
+              <w:rPr>
+                <w:rFonts w:ascii="Times New Roman" w:hAnsi="Times New Roman"/>
+                <w:sz w:val="20"/>
+              </w:rPr>
+              <w:t xml:space="preserve">При дозвоне заявителю номер карточки не называется, общение по сути заявления</w:t>
+            </w:r>
+          </w:p>
+        </w:tc>
+        <w:tc>
+          <w:tcPr/>
+          <w:p>
+            <w:pPr>
+              <w:pStyle w:val="Compact"/>
+              <w:spacing w:line="240" w:lineRule="auto"/>
+              <w:ind w:firstLine="0"/>
+              <w:jc w:val="left"/>
+            </w:pPr>
+            <w:r>
+              <w:rPr>
+                <w:rFonts w:ascii="Times New Roman" w:hAnsi="Times New Roman"/>
+                <w:sz w:val="20"/>
+              </w:rPr>
+              <w:t xml:space="preserve">—</w:t>
+            </w:r>
+          </w:p>
+        </w:tc>
+        <w:tc>
+          <w:tcPr/>
+          <w:p>
+            <w:pPr>
+              <w:pStyle w:val="Compact"/>
+              <w:spacing w:line="240" w:lineRule="auto"/>
+              <w:ind w:firstLine="0"/>
+              <w:jc w:val="left"/>
+            </w:pPr>
+            <w:r>
+              <w:rPr>
+                <w:rFonts w:ascii="Times New Roman" w:hAnsi="Times New Roman"/>
+                <w:sz w:val="20"/>
+              </w:rPr>
+              <w:t xml:space="preserve">3.3</w:t>
+            </w:r>
+          </w:p>
+        </w:tc>
+        <w:tc>
+          <w:tcPr/>
+          <w:p>
+            <w:pPr>
+              <w:pStyle w:val="Compact"/>
+              <w:spacing w:line="240" w:lineRule="auto"/>
+              <w:ind w:firstLine="0"/>
+              <w:jc w:val="left"/>
+            </w:pPr>
+            <w:r>
+              <w:rPr>
+                <w:rFonts w:ascii="Times New Roman" w:hAnsi="Times New Roman"/>
+                <w:sz w:val="20"/>
+              </w:rPr>
+              <w:t xml:space="preserve">—</w:t>
+            </w:r>
+          </w:p>
+        </w:tc>
+        <w:tc>
+          <w:tcPr/>
+          <w:p>
+            <w:pPr>
+              <w:pStyle w:val="Compact"/>
+              <w:spacing w:line="240" w:lineRule="auto"/>
+              <w:ind w:firstLine="0"/>
+              <w:jc w:val="left"/>
+            </w:pPr>
+            <w:r>
+              <w:rPr>
+                <w:rFonts w:ascii="Times New Roman" w:hAnsi="Times New Roman"/>
+                <w:sz w:val="20"/>
+              </w:rPr>
+              <w:t xml:space="preserve">правило поведения диспетчера; в оценке не проверяется</w:t>
+            </w:r>
+          </w:p>
+        </w:tc>
+      </w:tr>
+      <w:tr>
+        <w:tc>
+          <w:tcPr/>
+          <w:p>
+            <w:pPr>
+              <w:pStyle w:val="Compact"/>
+              <w:spacing w:line="240" w:lineRule="auto"/>
+              <w:ind w:firstLine="0"/>
+              <w:jc w:val="left"/>
+            </w:pPr>
+            <w:r>
+              <w:rPr>
+                <w:rFonts w:ascii="Times New Roman" w:hAnsi="Times New Roman"/>
+                <w:sz w:val="20"/>
+              </w:rPr>
+              <w:t xml:space="preserve">5.10</w:t>
+            </w:r>
+          </w:p>
+        </w:tc>
+        <w:tc>
+          <w:tcPr/>
+          <w:p>
+            <w:pPr>
+              <w:pStyle w:val="Compact"/>
+              <w:spacing w:line="240" w:lineRule="auto"/>
+              <w:ind w:firstLine="0"/>
+              <w:jc w:val="left"/>
+            </w:pPr>
+            <w:r>
+              <w:rPr>
+                <w:rFonts w:ascii="Times New Roman" w:hAnsi="Times New Roman"/>
+                <w:sz w:val="20"/>
+              </w:rPr>
+              <w:t xml:space="preserve">Оценка: правильность решения принять/отклонить, порядок и полнота статусов, содержание и грамматика комментариев, время реакции по каждой карточке…</w:t>
+            </w:r>
+          </w:p>
+        </w:tc>
+        <w:tc>
+          <w:tcPr/>
+          <w:p>
+            <w:pPr>
+              <w:pStyle w:val="Compact"/>
+              <w:spacing w:line="240" w:lineRule="auto"/>
+              <w:ind w:firstLine="0"/>
+              <w:jc w:val="left"/>
+            </w:pPr>
+            <w:r>
+              <w:rPr>
+                <w:rFonts w:ascii="Times New Roman" w:hAnsi="Times New Roman"/>
+                <w:sz w:val="20"/>
+              </w:rPr>
+              <w:t xml:space="preserve">M</w:t>
+            </w:r>
+          </w:p>
+        </w:tc>
+        <w:tc>
+          <w:tcPr/>
+          <w:p>
+            <w:pPr>
+              <w:pStyle w:val="Compact"/>
+              <w:spacing w:line="240" w:lineRule="auto"/>
+              <w:ind w:firstLine="0"/>
+              <w:jc w:val="left"/>
+            </w:pPr>
+            <w:r>
+              <w:rPr>
+                <w:rFonts w:ascii="Times New Roman" w:hAnsi="Times New Roman"/>
+                <w:sz w:val="20"/>
+              </w:rPr>
+              <w:t xml:space="preserve">3.4</w:t>
+            </w:r>
+          </w:p>
+        </w:tc>
+        <w:tc>
+          <w:tcPr/>
+          <w:p>
+            <w:pPr>
+              <w:pStyle w:val="Compact"/>
+              <w:spacing w:line="240" w:lineRule="auto"/>
+              <w:ind w:firstLine="0"/>
+              <w:jc w:val="left"/>
+            </w:pPr>
+            <w:r>
+              <w:rPr>
+                <w:rFonts w:ascii="Times New Roman" w:hAnsi="Times New Roman"/>
+                <w:sz w:val="20"/>
+              </w:rPr>
+              <w:t xml:space="preserve">да</w:t>
+            </w:r>
+          </w:p>
+        </w:tc>
+        <w:tc>
+          <w:tcPr/>
+          <w:p>
+            <w:pPr>
+              <w:pStyle w:val="Compact"/>
+              <w:spacing w:line="240" w:lineRule="auto"/>
+              <w:ind w:firstLine="0"/>
+              <w:jc w:val="left"/>
+            </w:pPr>
+            <w:r>
+              <w:rPr>
+                <w:rFonts w:ascii="Times New Roman" w:hAnsi="Times New Roman"/>
+                <w:sz w:val="20"/>
+              </w:rPr>
+              <w:t xml:space="preserve">решение, время реакции, порядок и полнота статусов, наряд, комментарии, звонки, регламентность и грамотность</w:t>
+            </w:r>
+          </w:p>
+        </w:tc>
+      </w:tr>
+      <w:tr>
+        <w:tc>
+          <w:tcPr/>
+          <w:p>
+            <w:pPr>
+              <w:pStyle w:val="Compact"/>
+              <w:spacing w:line="240" w:lineRule="auto"/>
+              <w:ind w:firstLine="0"/>
+              <w:jc w:val="left"/>
+            </w:pPr>
+            <w:r>
+              <w:rPr>
+                <w:rFonts w:ascii="Times New Roman" w:hAnsi="Times New Roman"/>
+                <w:sz w:val="20"/>
+              </w:rPr>
+              <w:t xml:space="preserve">6.1</w:t>
+            </w:r>
+          </w:p>
+        </w:tc>
+        <w:tc>
+          <w:tcPr/>
+          <w:p>
+            <w:pPr>
+              <w:pStyle w:val="Compact"/>
+              <w:spacing w:line="240" w:lineRule="auto"/>
+              <w:ind w:firstLine="0"/>
+              <w:jc w:val="left"/>
+            </w:pPr>
+            <w:r>
+              <w:rPr>
+                <w:rFonts w:ascii="Times New Roman" w:hAnsi="Times New Roman"/>
+                <w:sz w:val="20"/>
+              </w:rPr>
+              <w:t xml:space="preserve">Имитация входящих и исходящих звонков внутри системы (софтфон в браузере: входящий звонок, ответ, удержание, завершение, журнал), «звонки в базе»</w:t>
+            </w:r>
+          </w:p>
+        </w:tc>
+        <w:tc>
+          <w:tcPr/>
+          <w:p>
+            <w:pPr>
+              <w:pStyle w:val="Compact"/>
+              <w:spacing w:line="240" w:lineRule="auto"/>
+              <w:ind w:firstLine="0"/>
+              <w:jc w:val="left"/>
+            </w:pPr>
+            <w:r>
+              <w:rPr>
+                <w:rFonts w:ascii="Times New Roman" w:hAnsi="Times New Roman"/>
+                <w:sz w:val="20"/>
+              </w:rPr>
+              <w:t xml:space="preserve">M</w:t>
+            </w:r>
+          </w:p>
+        </w:tc>
+        <w:tc>
+          <w:tcPr/>
+          <w:p>
+            <w:pPr>
+              <w:pStyle w:val="Compact"/>
+              <w:spacing w:line="240" w:lineRule="auto"/>
+              <w:ind w:firstLine="0"/>
+              <w:jc w:val="left"/>
+            </w:pPr>
+            <w:r>
+              <w:rPr>
+                <w:rFonts w:ascii="Times New Roman" w:hAnsi="Times New Roman"/>
+                <w:sz w:val="20"/>
+              </w:rPr>
+              <w:t xml:space="preserve">1.4, 2.3</w:t>
+            </w:r>
+          </w:p>
+        </w:tc>
+        <w:tc>
+          <w:tcPr/>
+          <w:p>
+            <w:pPr>
+              <w:pStyle w:val="Compact"/>
+              <w:spacing w:line="240" w:lineRule="auto"/>
+              <w:ind w:firstLine="0"/>
+              <w:jc w:val="left"/>
+            </w:pPr>
+            <w:r>
+              <w:rPr>
+                <w:rFonts w:ascii="Times New Roman" w:hAnsi="Times New Roman"/>
+                <w:sz w:val="20"/>
+              </w:rPr>
+              <w:t xml:space="preserve">да</w:t>
+            </w:r>
+          </w:p>
+        </w:tc>
+        <w:tc>
+          <w:tcPr/>
+          <w:p>
+            <w:pPr>
+              <w:pStyle w:val="Compact"/>
+              <w:spacing w:line="240" w:lineRule="auto"/>
+              <w:ind w:firstLine="0"/>
+              <w:jc w:val="left"/>
+            </w:pPr>
+            <w:r>
+              <w:rPr>
+                <w:rFonts w:ascii="Times New Roman" w:hAnsi="Times New Roman"/>
+                <w:sz w:val="20"/>
+              </w:rPr>
+              <w:t xml:space="preserve">входящий вызов, ответ, разговор, завершение, журнал звонков по карточке</w:t>
+            </w:r>
+          </w:p>
+        </w:tc>
+      </w:tr>
+      <w:tr>
+        <w:tc>
+          <w:tcPr/>
+          <w:p>
+            <w:pPr>
+              <w:pStyle w:val="Compact"/>
+              <w:spacing w:line="240" w:lineRule="auto"/>
+              <w:ind w:firstLine="0"/>
+              <w:jc w:val="left"/>
+            </w:pPr>
+            <w:r>
+              <w:rPr>
+                <w:rFonts w:ascii="Times New Roman" w:hAnsi="Times New Roman"/>
+                <w:sz w:val="20"/>
+              </w:rPr>
+              <w:t xml:space="preserve">6.2</w:t>
+            </w:r>
+          </w:p>
+        </w:tc>
+        <w:tc>
+          <w:tcPr/>
+          <w:p>
+            <w:pPr>
+              <w:pStyle w:val="Compact"/>
+              <w:spacing w:line="240" w:lineRule="auto"/>
+              <w:ind w:firstLine="0"/>
+              <w:jc w:val="left"/>
+            </w:pPr>
+            <w:r>
+              <w:rPr>
+                <w:rFonts w:ascii="Times New Roman" w:hAnsi="Times New Roman"/>
+                <w:sz w:val="20"/>
+              </w:rPr>
+              <w:t xml:space="preserve">Голос «участника событий»/старшего группы через TTS, распознавание речи обучающегося (STT) для оценки голосового ответа</w:t>
+            </w:r>
+          </w:p>
+        </w:tc>
+        <w:tc>
+          <w:tcPr/>
+          <w:p>
+            <w:pPr>
+              <w:pStyle w:val="Compact"/>
+              <w:spacing w:line="240" w:lineRule="auto"/>
+              <w:ind w:firstLine="0"/>
+              <w:jc w:val="left"/>
+            </w:pPr>
+            <w:r>
+              <w:rPr>
+                <w:rFonts w:ascii="Times New Roman" w:hAnsi="Times New Roman"/>
+                <w:sz w:val="20"/>
+              </w:rPr>
+              <w:t xml:space="preserve">S</w:t>
+            </w:r>
+          </w:p>
+        </w:tc>
+        <w:tc>
+          <w:tcPr/>
+          <w:p>
+            <w:pPr>
+              <w:pStyle w:val="Compact"/>
+              <w:spacing w:line="240" w:lineRule="auto"/>
+              <w:ind w:firstLine="0"/>
+              <w:jc w:val="left"/>
+            </w:pPr>
+            <w:r>
+              <w:rPr>
+                <w:rFonts w:ascii="Times New Roman" w:hAnsi="Times New Roman"/>
+                <w:sz w:val="20"/>
+              </w:rPr>
+              <w:t xml:space="preserve">1.4</w:t>
+            </w:r>
+          </w:p>
+        </w:tc>
+        <w:tc>
+          <w:tcPr/>
+          <w:p>
+            <w:pPr>
+              <w:pStyle w:val="Compact"/>
+              <w:spacing w:line="240" w:lineRule="auto"/>
+              <w:ind w:firstLine="0"/>
+              <w:jc w:val="left"/>
+            </w:pPr>
+            <w:r>
+              <w:rPr>
+                <w:rFonts w:ascii="Times New Roman" w:hAnsi="Times New Roman"/>
+                <w:sz w:val="20"/>
+              </w:rPr>
               <w:t xml:space="preserve">частично</w:t>
             </w:r>
           </w:p>
@@ -16152,777 +16922,7 @@
                 <w:rFonts w:ascii="Times New Roman" w:hAnsi="Times New Roman"/>
                 <w:sz w:val="20"/>
               </w:rPr>
-              <w:t xml:space="preserve">силы фиксируются номером наряда и комментарием; справочника бригад для выбора нет</w:t>
-            </w:r>
-          </w:p>
-        </w:tc>
-      </w:tr>
-      <w:tr>
-        <w:tc>
-          <w:tcPr/>
-          <w:p>
-            <w:pPr>
-              <w:pStyle w:val="Compact"/>
-              <w:spacing w:line="240" w:lineRule="auto"/>
-              <w:ind w:firstLine="0"/>
-              <w:jc w:val="left"/>
-            </w:pPr>
-            <w:r>
-              <w:rPr>
-                <w:rFonts w:ascii="Times New Roman" w:hAnsi="Times New Roman"/>
-                <w:sz w:val="20"/>
-              </w:rPr>
-              <w:t xml:space="preserve">5.6</w:t>
-            </w:r>
-          </w:p>
-        </w:tc>
-        <w:tc>
-          <w:tcPr/>
-          <w:p>
-            <w:pPr>
-              <w:pStyle w:val="Compact"/>
-              <w:spacing w:line="240" w:lineRule="auto"/>
-              <w:ind w:firstLine="0"/>
-              <w:jc w:val="left"/>
-            </w:pPr>
-            <w:r>
-              <w:rPr>
-                <w:rFonts w:ascii="Times New Roman" w:hAnsi="Times New Roman"/>
-                <w:sz w:val="20"/>
-              </w:rPr>
-              <w:t xml:space="preserve">Связь по IP-телефону: исходящий звонок старшему группы реагирования (точка C), звонок заявителю (номер в карточке), входящий доклад от старшего…</w:t>
-            </w:r>
-          </w:p>
-        </w:tc>
-        <w:tc>
-          <w:tcPr/>
-          <w:p>
-            <w:pPr>
-              <w:pStyle w:val="Compact"/>
-              <w:spacing w:line="240" w:lineRule="auto"/>
-              <w:ind w:firstLine="0"/>
-              <w:jc w:val="left"/>
-            </w:pPr>
-            <w:r>
-              <w:rPr>
-                <w:rFonts w:ascii="Times New Roman" w:hAnsi="Times New Roman"/>
-                <w:sz w:val="20"/>
-              </w:rPr>
-              <w:t xml:space="preserve">M</w:t>
-            </w:r>
-          </w:p>
-        </w:tc>
-        <w:tc>
-          <w:tcPr/>
-          <w:p>
-            <w:pPr>
-              <w:pStyle w:val="Compact"/>
-              <w:spacing w:line="240" w:lineRule="auto"/>
-              <w:ind w:firstLine="0"/>
-              <w:jc w:val="left"/>
-            </w:pPr>
-            <w:r>
-              <w:rPr>
-                <w:rFonts w:ascii="Times New Roman" w:hAnsi="Times New Roman"/>
-                <w:sz w:val="20"/>
-              </w:rPr>
-              <w:t xml:space="preserve">2.3</w:t>
-            </w:r>
-          </w:p>
-        </w:tc>
-        <w:tc>
-          <w:tcPr/>
-          <w:p>
-            <w:pPr>
-              <w:pStyle w:val="Compact"/>
-              <w:spacing w:line="240" w:lineRule="auto"/>
-              <w:ind w:firstLine="0"/>
-              <w:jc w:val="left"/>
-            </w:pPr>
-            <w:r>
-              <w:rPr>
-                <w:rFonts w:ascii="Times New Roman" w:hAnsi="Times New Roman"/>
-                <w:sz w:val="20"/>
-              </w:rPr>
-              <w:t xml:space="preserve">да</w:t>
-            </w:r>
-          </w:p>
-        </w:tc>
-        <w:tc>
-          <w:tcPr/>
-          <w:p>
-            <w:pPr>
-              <w:pStyle w:val="Compact"/>
-              <w:spacing w:line="240" w:lineRule="auto"/>
-              <w:ind w:firstLine="0"/>
-              <w:jc w:val="left"/>
-            </w:pPr>
-            <w:r>
-              <w:rPr>
-                <w:rFonts w:ascii="Times New Roman" w:hAnsi="Times New Roman"/>
-                <w:sz w:val="20"/>
-              </w:rPr>
-              <w:t xml:space="preserve">имитация: старший группы, заявитель, другие службы; реальная SIP-телефония — нет</w:t>
-            </w:r>
-          </w:p>
-        </w:tc>
-      </w:tr>
-      <w:tr>
-        <w:tc>
-          <w:tcPr/>
-          <w:p>
-            <w:pPr>
-              <w:pStyle w:val="Compact"/>
-              <w:spacing w:line="240" w:lineRule="auto"/>
-              <w:ind w:firstLine="0"/>
-              <w:jc w:val="left"/>
-            </w:pPr>
-            <w:r>
-              <w:rPr>
-                <w:rFonts w:ascii="Times New Roman" w:hAnsi="Times New Roman"/>
-                <w:sz w:val="20"/>
-              </w:rPr>
-              <w:t xml:space="preserve">5.7</w:t>
-            </w:r>
-          </w:p>
-        </w:tc>
-        <w:tc>
-          <w:tcPr/>
-          <w:p>
-            <w:pPr>
-              <w:pStyle w:val="Compact"/>
-              <w:spacing w:line="240" w:lineRule="auto"/>
-              <w:ind w:firstLine="0"/>
-              <w:jc w:val="left"/>
-            </w:pPr>
-            <w:r>
-              <w:rPr>
-                <w:rFonts w:ascii="Times New Roman" w:hAnsi="Times New Roman"/>
-                <w:sz w:val="20"/>
-              </w:rPr>
-              <w:t xml:space="preserve">Смена статуса через карандаш на плитке своей службы: строка «Статус ▾ / Номер наряда / Комментарий / ✓ ×». Первый статус — «Принята» или «Не…</w:t>
-            </w:r>
-          </w:p>
-        </w:tc>
-        <w:tc>
-          <w:tcPr/>
-          <w:p>
-            <w:pPr>
-              <w:pStyle w:val="Compact"/>
-              <w:spacing w:line="240" w:lineRule="auto"/>
-              <w:ind w:firstLine="0"/>
-              <w:jc w:val="left"/>
-            </w:pPr>
-            <w:r>
-              <w:rPr>
-                <w:rFonts w:ascii="Times New Roman" w:hAnsi="Times New Roman"/>
-                <w:sz w:val="20"/>
-              </w:rPr>
-              <w:t xml:space="preserve">M</w:t>
-            </w:r>
-          </w:p>
-        </w:tc>
-        <w:tc>
-          <w:tcPr/>
-          <w:p>
-            <w:pPr>
-              <w:pStyle w:val="Compact"/>
-              <w:spacing w:line="240" w:lineRule="auto"/>
-              <w:ind w:firstLine="0"/>
-              <w:jc w:val="left"/>
-            </w:pPr>
-            <w:r>
-              <w:rPr>
-                <w:rFonts w:ascii="Times New Roman" w:hAnsi="Times New Roman"/>
-                <w:sz w:val="20"/>
-              </w:rPr>
-              <w:t xml:space="preserve">2.2</w:t>
-            </w:r>
-          </w:p>
-        </w:tc>
-        <w:tc>
-          <w:tcPr/>
-          <w:p>
-            <w:pPr>
-              <w:pStyle w:val="Compact"/>
-              <w:spacing w:line="240" w:lineRule="auto"/>
-              <w:ind w:firstLine="0"/>
-              <w:jc w:val="left"/>
-            </w:pPr>
-            <w:r>
-              <w:rPr>
-                <w:rFonts w:ascii="Times New Roman" w:hAnsi="Times New Roman"/>
-                <w:sz w:val="20"/>
-              </w:rPr>
-              <w:t xml:space="preserve">да</w:t>
-            </w:r>
-          </w:p>
-        </w:tc>
-        <w:tc>
-          <w:tcPr/>
-          <w:p>
-            <w:pPr>
-              <w:pStyle w:val="Compact"/>
-              <w:spacing w:line="240" w:lineRule="auto"/>
-              <w:ind w:firstLine="0"/>
-              <w:jc w:val="left"/>
-            </w:pPr>
-            <w:r>
-              <w:rPr>
-                <w:rFonts w:ascii="Times New Roman" w:hAnsi="Times New Roman"/>
-                <w:sz w:val="20"/>
-              </w:rPr>
-              <w:t xml:space="preserve">карандаш на плитке службы: статус, номер наряда, комментарий</w:t>
-            </w:r>
-          </w:p>
-        </w:tc>
-      </w:tr>
-      <w:tr>
-        <w:tc>
-          <w:tcPr/>
-          <w:p>
-            <w:pPr>
-              <w:pStyle w:val="Compact"/>
-              <w:spacing w:line="240" w:lineRule="auto"/>
-              <w:ind w:firstLine="0"/>
-              <w:jc w:val="left"/>
-            </w:pPr>
-            <w:r>
-              <w:rPr>
-                <w:rFonts w:ascii="Times New Roman" w:hAnsi="Times New Roman"/>
-                <w:sz w:val="20"/>
-              </w:rPr>
-              <w:t xml:space="preserve">5.8</w:t>
-            </w:r>
-          </w:p>
-        </w:tc>
-        <w:tc>
-          <w:tcPr/>
-          <w:p>
-            <w:pPr>
-              <w:pStyle w:val="Compact"/>
-              <w:spacing w:line="240" w:lineRule="auto"/>
-              <w:ind w:firstLine="0"/>
-              <w:jc w:val="left"/>
-            </w:pPr>
-            <w:r>
-              <w:rPr>
-                <w:rFonts w:ascii="Times New Roman" w:hAnsi="Times New Roman"/>
-                <w:sz w:val="20"/>
-              </w:rPr>
-              <w:t xml:space="preserve">Универсальный алгоритм действий диспетчера для всех служб, без специфики службы</w:t>
-            </w:r>
-          </w:p>
-        </w:tc>
-        <w:tc>
-          <w:tcPr/>
-          <w:p>
-            <w:pPr>
-              <w:pStyle w:val="Compact"/>
-              <w:spacing w:line="240" w:lineRule="auto"/>
-              <w:ind w:firstLine="0"/>
-              <w:jc w:val="left"/>
-            </w:pPr>
-            <w:r>
-              <w:rPr>
-                <w:rFonts w:ascii="Times New Roman" w:hAnsi="Times New Roman"/>
-                <w:sz w:val="20"/>
-              </w:rPr>
-              <w:t xml:space="preserve">M</w:t>
-            </w:r>
-          </w:p>
-        </w:tc>
-        <w:tc>
-          <w:tcPr/>
-          <w:p>
-            <w:pPr>
-              <w:pStyle w:val="Compact"/>
-              <w:spacing w:line="240" w:lineRule="auto"/>
-              <w:ind w:firstLine="0"/>
-              <w:jc w:val="left"/>
-            </w:pPr>
-            <w:r>
-              <w:rPr>
-                <w:rFonts w:ascii="Times New Roman" w:hAnsi="Times New Roman"/>
-                <w:sz w:val="20"/>
-              </w:rPr>
-              <w:t xml:space="preserve">2.2</w:t>
-            </w:r>
-          </w:p>
-        </w:tc>
-        <w:tc>
-          <w:tcPr/>
-          <w:p>
-            <w:pPr>
-              <w:pStyle w:val="Compact"/>
-              <w:spacing w:line="240" w:lineRule="auto"/>
-              <w:ind w:firstLine="0"/>
-              <w:jc w:val="left"/>
-            </w:pPr>
-            <w:r>
-              <w:rPr>
-                <w:rFonts w:ascii="Times New Roman" w:hAnsi="Times New Roman"/>
-                <w:sz w:val="20"/>
-              </w:rPr>
-              <w:t xml:space="preserve">да</w:t>
-            </w:r>
-          </w:p>
-        </w:tc>
-        <w:tc>
-          <w:tcPr/>
-          <w:p>
-            <w:pPr>
-              <w:pStyle w:val="Compact"/>
-              <w:spacing w:line="240" w:lineRule="auto"/>
-              <w:ind w:firstLine="0"/>
-              <w:jc w:val="left"/>
-            </w:pPr>
-            <w:r>
-              <w:rPr>
-                <w:rFonts w:ascii="Times New Roman" w:hAnsi="Times New Roman"/>
-                <w:sz w:val="20"/>
-              </w:rPr>
-              <w:t xml:space="preserve">единый набор статусов для всех служб</w:t>
-            </w:r>
-          </w:p>
-        </w:tc>
-      </w:tr>
-      <w:tr>
-        <w:tc>
-          <w:tcPr/>
-          <w:p>
-            <w:pPr>
-              <w:pStyle w:val="Compact"/>
-              <w:spacing w:line="240" w:lineRule="auto"/>
-              <w:ind w:firstLine="0"/>
-              <w:jc w:val="left"/>
-            </w:pPr>
-            <w:r>
-              <w:rPr>
-                <w:rFonts w:ascii="Times New Roman" w:hAnsi="Times New Roman"/>
-                <w:sz w:val="20"/>
-              </w:rPr>
-              <w:t xml:space="preserve">5.9</w:t>
-            </w:r>
-          </w:p>
-        </w:tc>
-        <w:tc>
-          <w:tcPr/>
-          <w:p>
-            <w:pPr>
-              <w:pStyle w:val="Compact"/>
-              <w:spacing w:line="240" w:lineRule="auto"/>
-              <w:ind w:firstLine="0"/>
-              <w:jc w:val="left"/>
-            </w:pPr>
-            <w:r>
-              <w:rPr>
-                <w:rFonts w:ascii="Times New Roman" w:hAnsi="Times New Roman"/>
-                <w:sz w:val="20"/>
-              </w:rPr>
-              <w:t xml:space="preserve">При дозвоне заявителю номер карточки не называется, общение по сути заявления</w:t>
-            </w:r>
-          </w:p>
-        </w:tc>
-        <w:tc>
-          <w:tcPr/>
-          <w:p>
-            <w:pPr>
-              <w:pStyle w:val="Compact"/>
-              <w:spacing w:line="240" w:lineRule="auto"/>
-              <w:ind w:firstLine="0"/>
-              <w:jc w:val="left"/>
-            </w:pPr>
-            <w:r>
-              <w:rPr>
-                <w:rFonts w:ascii="Times New Roman" w:hAnsi="Times New Roman"/>
-                <w:sz w:val="20"/>
-              </w:rPr>
-              <w:t xml:space="preserve">—</w:t>
-            </w:r>
-          </w:p>
-        </w:tc>
-        <w:tc>
-          <w:tcPr/>
-          <w:p>
-            <w:pPr>
-              <w:pStyle w:val="Compact"/>
-              <w:spacing w:line="240" w:lineRule="auto"/>
-              <w:ind w:firstLine="0"/>
-              <w:jc w:val="left"/>
-            </w:pPr>
-            <w:r>
-              <w:rPr>
-                <w:rFonts w:ascii="Times New Roman" w:hAnsi="Times New Roman"/>
-                <w:sz w:val="20"/>
-              </w:rPr>
-              <w:t xml:space="preserve">3.3</w:t>
-            </w:r>
-          </w:p>
-        </w:tc>
-        <w:tc>
-          <w:tcPr/>
-          <w:p>
-            <w:pPr>
-              <w:pStyle w:val="Compact"/>
-              <w:spacing w:line="240" w:lineRule="auto"/>
-              <w:ind w:firstLine="0"/>
-              <w:jc w:val="left"/>
-            </w:pPr>
-            <w:r>
-              <w:rPr>
-                <w:rFonts w:ascii="Times New Roman" w:hAnsi="Times New Roman"/>
-                <w:sz w:val="20"/>
-              </w:rPr>
-              <w:t xml:space="preserve">—</w:t>
-            </w:r>
-          </w:p>
-        </w:tc>
-        <w:tc>
-          <w:tcPr/>
-          <w:p>
-            <w:pPr>
-              <w:pStyle w:val="Compact"/>
-              <w:spacing w:line="240" w:lineRule="auto"/>
-              <w:ind w:firstLine="0"/>
-              <w:jc w:val="left"/>
-            </w:pPr>
-            <w:r>
-              <w:rPr>
-                <w:rFonts w:ascii="Times New Roman" w:hAnsi="Times New Roman"/>
-                <w:sz w:val="20"/>
-              </w:rPr>
-              <w:t xml:space="preserve">правило поведения диспетчера; в оценке не проверяется</w:t>
-            </w:r>
-          </w:p>
-        </w:tc>
-      </w:tr>
-      <w:tr>
-        <w:tc>
-          <w:tcPr/>
-          <w:p>
-            <w:pPr>
-              <w:pStyle w:val="Compact"/>
-              <w:spacing w:line="240" w:lineRule="auto"/>
-              <w:ind w:firstLine="0"/>
-              <w:jc w:val="left"/>
-            </w:pPr>
-            <w:r>
-              <w:rPr>
-                <w:rFonts w:ascii="Times New Roman" w:hAnsi="Times New Roman"/>
-                <w:sz w:val="20"/>
-              </w:rPr>
-              <w:t xml:space="preserve">5.10</w:t>
-            </w:r>
-          </w:p>
-        </w:tc>
-        <w:tc>
-          <w:tcPr/>
-          <w:p>
-            <w:pPr>
-              <w:pStyle w:val="Compact"/>
-              <w:spacing w:line="240" w:lineRule="auto"/>
-              <w:ind w:firstLine="0"/>
-              <w:jc w:val="left"/>
-            </w:pPr>
-            <w:r>
-              <w:rPr>
-                <w:rFonts w:ascii="Times New Roman" w:hAnsi="Times New Roman"/>
-                <w:sz w:val="20"/>
-              </w:rPr>
-              <w:t xml:space="preserve">Оценка: правильность решения принять/отклонить, порядок и полнота статусов, содержание и грамматика комментариев, время реакции по каждой карточке…</w:t>
-            </w:r>
-          </w:p>
-        </w:tc>
-        <w:tc>
-          <w:tcPr/>
-          <w:p>
-            <w:pPr>
-              <w:pStyle w:val="Compact"/>
-              <w:spacing w:line="240" w:lineRule="auto"/>
-              <w:ind w:firstLine="0"/>
-              <w:jc w:val="left"/>
-            </w:pPr>
-            <w:r>
-              <w:rPr>
-                <w:rFonts w:ascii="Times New Roman" w:hAnsi="Times New Roman"/>
-                <w:sz w:val="20"/>
-              </w:rPr>
-              <w:t xml:space="preserve">M</w:t>
-            </w:r>
-          </w:p>
-        </w:tc>
-        <w:tc>
-          <w:tcPr/>
-          <w:p>
-            <w:pPr>
-              <w:pStyle w:val="Compact"/>
-              <w:spacing w:line="240" w:lineRule="auto"/>
-              <w:ind w:firstLine="0"/>
-              <w:jc w:val="left"/>
-            </w:pPr>
-            <w:r>
-              <w:rPr>
-                <w:rFonts w:ascii="Times New Roman" w:hAnsi="Times New Roman"/>
-                <w:sz w:val="20"/>
-              </w:rPr>
-              <w:t xml:space="preserve">3.4</w:t>
-            </w:r>
-          </w:p>
-        </w:tc>
-        <w:tc>
-          <w:tcPr/>
-          <w:p>
-            <w:pPr>
-              <w:pStyle w:val="Compact"/>
-              <w:spacing w:line="240" w:lineRule="auto"/>
-              <w:ind w:firstLine="0"/>
-              <w:jc w:val="left"/>
-            </w:pPr>
-            <w:r>
-              <w:rPr>
-                <w:rFonts w:ascii="Times New Roman" w:hAnsi="Times New Roman"/>
-                <w:sz w:val="20"/>
-              </w:rPr>
-              <w:t xml:space="preserve">да</w:t>
-            </w:r>
-          </w:p>
-        </w:tc>
-        <w:tc>
-          <w:tcPr/>
-          <w:p>
-            <w:pPr>
-              <w:pStyle w:val="Compact"/>
-              <w:spacing w:line="240" w:lineRule="auto"/>
-              <w:ind w:firstLine="0"/>
-              <w:jc w:val="left"/>
-            </w:pPr>
-            <w:r>
-              <w:rPr>
-                <w:rFonts w:ascii="Times New Roman" w:hAnsi="Times New Roman"/>
-                <w:sz w:val="20"/>
-              </w:rPr>
-              <w:t xml:space="preserve">решение, время реакции, порядок и полнота статусов, наряд, комментарии, звонки, регламентность и грамотность</w:t>
-            </w:r>
-          </w:p>
-        </w:tc>
-      </w:tr>
-      <w:tr>
-        <w:tc>
-          <w:tcPr/>
-          <w:p>
-            <w:pPr>
-              <w:pStyle w:val="Compact"/>
-              <w:spacing w:line="240" w:lineRule="auto"/>
-              <w:ind w:firstLine="0"/>
-              <w:jc w:val="left"/>
-            </w:pPr>
-            <w:r>
-              <w:rPr>
-                <w:rFonts w:ascii="Times New Roman" w:hAnsi="Times New Roman"/>
-                <w:sz w:val="20"/>
-              </w:rPr>
-              <w:t xml:space="preserve">6.1</w:t>
-            </w:r>
-          </w:p>
-        </w:tc>
-        <w:tc>
-          <w:tcPr/>
-          <w:p>
-            <w:pPr>
-              <w:pStyle w:val="Compact"/>
-              <w:spacing w:line="240" w:lineRule="auto"/>
-              <w:ind w:firstLine="0"/>
-              <w:jc w:val="left"/>
-            </w:pPr>
-            <w:r>
-              <w:rPr>
-                <w:rFonts w:ascii="Times New Roman" w:hAnsi="Times New Roman"/>
-                <w:sz w:val="20"/>
-              </w:rPr>
-              <w:t xml:space="preserve">Имитация входящих и исходящих звонков внутри системы (софтфон в браузере: входящий звонок, ответ, удержание, завершение, журнал), «звонки в базе»</w:t>
-            </w:r>
-          </w:p>
-        </w:tc>
-        <w:tc>
-          <w:tcPr/>
-          <w:p>
-            <w:pPr>
-              <w:pStyle w:val="Compact"/>
-              <w:spacing w:line="240" w:lineRule="auto"/>
-              <w:ind w:firstLine="0"/>
-              <w:jc w:val="left"/>
-            </w:pPr>
-            <w:r>
-              <w:rPr>
-                <w:rFonts w:ascii="Times New Roman" w:hAnsi="Times New Roman"/>
-                <w:sz w:val="20"/>
-              </w:rPr>
-              <w:t xml:space="preserve">M</w:t>
-            </w:r>
-          </w:p>
-        </w:tc>
-        <w:tc>
-          <w:tcPr/>
-          <w:p>
-            <w:pPr>
-              <w:pStyle w:val="Compact"/>
-              <w:spacing w:line="240" w:lineRule="auto"/>
-              <w:ind w:firstLine="0"/>
-              <w:jc w:val="left"/>
-            </w:pPr>
-            <w:r>
-              <w:rPr>
-                <w:rFonts w:ascii="Times New Roman" w:hAnsi="Times New Roman"/>
-                <w:sz w:val="20"/>
-              </w:rPr>
-              <w:t xml:space="preserve">1.4, 2.3</w:t>
-            </w:r>
-          </w:p>
-        </w:tc>
-        <w:tc>
-          <w:tcPr/>
-          <w:p>
-            <w:pPr>
-              <w:pStyle w:val="Compact"/>
-              <w:spacing w:line="240" w:lineRule="auto"/>
-              <w:ind w:firstLine="0"/>
-              <w:jc w:val="left"/>
-            </w:pPr>
-            <w:r>
-              <w:rPr>
-                <w:rFonts w:ascii="Times New Roman" w:hAnsi="Times New Roman"/>
-                <w:sz w:val="20"/>
-              </w:rPr>
-              <w:t xml:space="preserve">да</w:t>
-            </w:r>
-          </w:p>
-        </w:tc>
-        <w:tc>
-          <w:tcPr/>
-          <w:p>
-            <w:pPr>
-              <w:pStyle w:val="Compact"/>
-              <w:spacing w:line="240" w:lineRule="auto"/>
-              <w:ind w:firstLine="0"/>
-              <w:jc w:val="left"/>
-            </w:pPr>
-            <w:r>
-              <w:rPr>
-                <w:rFonts w:ascii="Times New Roman" w:hAnsi="Times New Roman"/>
-                <w:sz w:val="20"/>
-              </w:rPr>
-              <w:t xml:space="preserve">входящий вызов, ответ, разговор, завершение, журнал звонков по карточке</w:t>
-            </w:r>
-          </w:p>
-        </w:tc>
-      </w:tr>
-      <w:tr>
-        <w:tc>
-          <w:tcPr/>
-          <w:p>
-            <w:pPr>
-              <w:pStyle w:val="Compact"/>
-              <w:spacing w:line="240" w:lineRule="auto"/>
-              <w:ind w:firstLine="0"/>
-              <w:jc w:val="left"/>
-            </w:pPr>
-            <w:r>
-              <w:rPr>
-                <w:rFonts w:ascii="Times New Roman" w:hAnsi="Times New Roman"/>
-                <w:sz w:val="20"/>
-              </w:rPr>
-              <w:t xml:space="preserve">6.2</w:t>
-            </w:r>
-          </w:p>
-        </w:tc>
-        <w:tc>
-          <w:tcPr/>
-          <w:p>
-            <w:pPr>
-              <w:pStyle w:val="Compact"/>
-              <w:spacing w:line="240" w:lineRule="auto"/>
-              <w:ind w:firstLine="0"/>
-              <w:jc w:val="left"/>
-            </w:pPr>
-            <w:r>
-              <w:rPr>
-                <w:rFonts w:ascii="Times New Roman" w:hAnsi="Times New Roman"/>
-                <w:sz w:val="20"/>
-              </w:rPr>
-              <w:t xml:space="preserve">Голос «участника событий»/старшего группы через TTS, распознавание речи обучающегося (STT) для оценки голосового ответа</w:t>
-            </w:r>
-          </w:p>
-        </w:tc>
-        <w:tc>
-          <w:tcPr/>
-          <w:p>
-            <w:pPr>
-              <w:pStyle w:val="Compact"/>
-              <w:spacing w:line="240" w:lineRule="auto"/>
-              <w:ind w:firstLine="0"/>
-              <w:jc w:val="left"/>
-            </w:pPr>
-            <w:r>
-              <w:rPr>
-                <w:rFonts w:ascii="Times New Roman" w:hAnsi="Times New Roman"/>
-                <w:sz w:val="20"/>
-              </w:rPr>
-              <w:t xml:space="preserve">S</w:t>
-            </w:r>
-          </w:p>
-        </w:tc>
-        <w:tc>
-          <w:tcPr/>
-          <w:p>
-            <w:pPr>
-              <w:pStyle w:val="Compact"/>
-              <w:spacing w:line="240" w:lineRule="auto"/>
-              <w:ind w:firstLine="0"/>
-              <w:jc w:val="left"/>
-            </w:pPr>
-            <w:r>
-              <w:rPr>
-                <w:rFonts w:ascii="Times New Roman" w:hAnsi="Times New Roman"/>
-                <w:sz w:val="20"/>
-              </w:rPr>
-              <w:t xml:space="preserve">1.4</w:t>
-            </w:r>
-          </w:p>
-        </w:tc>
-        <w:tc>
-          <w:tcPr/>
-          <w:p>
-            <w:pPr>
-              <w:pStyle w:val="Compact"/>
-              <w:spacing w:line="240" w:lineRule="auto"/>
-              <w:ind w:firstLine="0"/>
-              <w:jc w:val="left"/>
-            </w:pPr>
-            <w:r>
-              <w:rPr>
-                <w:rFonts w:ascii="Times New Roman" w:hAnsi="Times New Roman"/>
-                <w:sz w:val="20"/>
-              </w:rPr>
-              <w:t xml:space="preserve">частично</w:t>
-            </w:r>
-          </w:p>
-        </w:tc>
-        <w:tc>
-          <w:tcPr/>
-          <w:p>
-            <w:pPr>
-              <w:pStyle w:val="Compact"/>
-              <w:spacing w:line="240" w:lineRule="auto"/>
-              <w:ind w:firstLine="0"/>
-              <w:jc w:val="left"/>
-            </w:pPr>
-            <w:r>
-              <w:rPr>
-                <w:rFonts w:ascii="Times New Roman" w:hAnsi="Times New Roman"/>
-                <w:sz w:val="20"/>
-              </w:rPr>
-              <w:t xml:space="preserve">озвучка реплик синтезом речи браузера; распознавание речи обучающегося — Whisper (локально на GPU/CPU или API); оценка голосового ответа идёт по распознанному тексту, интонация не оценивается</w:t>
+              <w:t xml:space="preserve">озвучка реплик синтезом речи браузера — есть; распознавание речи обучающегося — нет</w:t>
             </w:r>
           </w:p>
         </w:tc>
@@ -23590,7 +23590,7 @@
         <w:pStyle w:val="FirstParagraph"/>
       </w:pPr>
       <w:r>
-        <w:t xml:space="preserve">Всего операций: 106. Спецификация — файл</w:t>
+        <w:t xml:space="preserve">Всего операций: 104. Спецификация — файл</w:t>
       </w:r>
       <w:r>
         <w:t xml:space="preserve"> </w:t>
@@ -26538,9 +26538,9 @@
         </w:tblBorders>
       </w:tblPr>
       <w:tblGrid>
-        <w:gridCol w:w="1287"/>
-        <w:gridCol w:w="3564"/>
-        <w:gridCol w:w="3069"/>
+        <w:gridCol w:w="1303"/>
+        <w:gridCol w:w="3609"/>
+        <w:gridCol w:w="3007"/>
       </w:tblGrid>
       <w:tr>
         <w:trPr>
@@ -28307,120 +28307,6 @@
                 <w:sz w:val="20"/>
               </w:rPr>
               <w:t xml:space="preserve">Начать занятие</w:t>
-            </w:r>
-          </w:p>
-        </w:tc>
-      </w:tr>
-      <w:tr>
-        <w:tc>
-          <w:tcPr/>
-          <w:p>
-            <w:pPr>
-              <w:pStyle w:val="Compact"/>
-              <w:spacing w:line="240" w:lineRule="auto"/>
-              <w:ind w:firstLine="0"/>
-              <w:jc w:val="left"/>
-            </w:pPr>
-            <w:r>
-              <w:rPr>
-                <w:rFonts w:ascii="Times New Roman" w:hAnsi="Times New Roman"/>
-                <w:sz w:val="20"/>
-              </w:rPr>
-              <w:t xml:space="preserve">GET</w:t>
-            </w:r>
-          </w:p>
-        </w:tc>
-        <w:tc>
-          <w:tcPr/>
-          <w:p>
-            <w:pPr>
-              <w:pStyle w:val="Compact"/>
-              <w:spacing w:line="240" w:lineRule="auto"/>
-              <w:ind w:firstLine="0"/>
-              <w:jc w:val="left"/>
-            </w:pPr>
-            <w:r>
-              <w:rPr>
-                <w:rStyle w:val="VerbatimChar"/>
-                <w:rFonts w:ascii="Times New Roman" w:hAnsi="Times New Roman"/>
-                <w:sz w:val="20"/>
-              </w:rPr>
-              <w:t xml:space="preserve">/api/v1/training/speech</w:t>
-            </w:r>
-          </w:p>
-        </w:tc>
-        <w:tc>
-          <w:tcPr/>
-          <w:p>
-            <w:pPr>
-              <w:pStyle w:val="Compact"/>
-              <w:spacing w:line="240" w:lineRule="auto"/>
-              <w:ind w:firstLine="0"/>
-              <w:jc w:val="left"/>
-            </w:pPr>
-            <w:r>
-              <w:rPr>
-                <w:rFonts w:ascii="Times New Roman" w:hAnsi="Times New Roman"/>
-                <w:sz w:val="20"/>
-              </w:rPr>
-              <w:t xml:space="preserve">Доступен ли голосовой ввод (модель речи настроена)</w:t>
-            </w:r>
-          </w:p>
-        </w:tc>
-      </w:tr>
-      <w:tr>
-        <w:tc>
-          <w:tcPr/>
-          <w:p>
-            <w:pPr>
-              <w:pStyle w:val="Compact"/>
-              <w:spacing w:line="240" w:lineRule="auto"/>
-              <w:ind w:firstLine="0"/>
-              <w:jc w:val="left"/>
-            </w:pPr>
-            <w:r>
-              <w:rPr>
-                <w:rFonts w:ascii="Times New Roman" w:hAnsi="Times New Roman"/>
-                <w:sz w:val="20"/>
-              </w:rPr>
-              <w:t xml:space="preserve">POST</w:t>
-            </w:r>
-          </w:p>
-        </w:tc>
-        <w:tc>
-          <w:tcPr/>
-          <w:p>
-            <w:pPr>
-              <w:pStyle w:val="Compact"/>
-              <w:spacing w:line="240" w:lineRule="auto"/>
-              <w:ind w:firstLine="0"/>
-              <w:jc w:val="left"/>
-            </w:pPr>
-            <w:r>
-              <w:rPr>
-                <w:rStyle w:val="VerbatimChar"/>
-                <w:rFonts w:ascii="Times New Roman" w:hAnsi="Times New Roman"/>
-                <w:sz w:val="20"/>
-              </w:rPr>
-              <w:t xml:space="preserve">/api/v1/training/speech</w:t>
-            </w:r>
-          </w:p>
-        </w:tc>
-        <w:tc>
-          <w:tcPr/>
-          <w:p>
-            <w:pPr>
-              <w:pStyle w:val="Compact"/>
-              <w:spacing w:line="240" w:lineRule="auto"/>
-              <w:ind w:firstLine="0"/>
-              <w:jc w:val="left"/>
-            </w:pPr>
-            <w:r>
-              <w:rPr>
-                <w:rFonts w:ascii="Times New Roman" w:hAnsi="Times New Roman"/>
-                <w:sz w:val="20"/>
-              </w:rPr>
-              <w:t xml:space="preserve">Распознать реплику в трубку (голосовой ввод, Whisper)</w:t>
             </w:r>
           </w:p>
         </w:tc>

</xml_diff>